<commit_message>
ca5 opening-brief: typst/latex/docx on the shared cross-engine layout model; latex and docx XENG-001..003 pass, cross_engine: gate (fb-595.54.3)
Before: latex 15 pages, 47.9 % of lines alike; docx 15 vs 9 pages, 17.7 % (styles-only filter, no
cover, TOC/TOA or certificates, EB Garamond reference). After: 15 pages on every engine, 289/289 lines.
typst: xengine show rule, pitches 30.8/17/14 pt, spacings in pt, listing-row TOC/TOA, footnote
entries with leading 0 (they were at 20 pt), a list rule for loose lists (xengine's list paragraph
cannot hold an item's parbreak). latex: \usepackage{xengine}, \xe@lines, \addvspace, \xe@row rows,
typst's first-line-indent rule, the closing paragraph kept with the signature, word count as typst.
docx: rewritten on lib/docx/xengine: cover, labelled headings, TOC/TOA from a LibreOffice page map
(render.sh, pagemap.awk), signature blocks, certificates. Tier 1: typst 8/0, latex 11/0, docx 12/0.
</commit_message>
<xml_diff>
--- a/courts/fifth-circuit/court-of-appeals/opening-brief/docx/reference.docx
+++ b/courts/fifth-circuit/court-of-appeals/opening-brief/docx/reference.docx
@@ -314,9 +314,9 @@
       </w:r>
     </w:p>
     <w:sectPr>
-      <w:footnotePr>
-        <w:numRestart w:val="eachSect"/>
-      </w:footnotePr>
+      <w:footerReference w:type="default" r:id="rIdFooter1"/>
+      <w:pgSz w:w="12240" w:h="15840"/>
+      <w:pgMar w:top="1440" w:right="1440" w:bottom="1440" w:left="1440" w:header="720" w:footer="432" w:gutter="0"/>
     </w:sectPr>
   </w:body>
 </w:document>
@@ -324,6 +324,31 @@
 
 <file path=word/comments.xml><?xml version="1.0" encoding="utf-8"?>
 <w:comments xmlns:w="http://schemas.openxmlformats.org/wordprocessingml/2006/main" xmlns:m="http://schemas.openxmlformats.org/officeDocument/2006/math" xmlns:r="http://schemas.openxmlformats.org/officeDocument/2006/relationships" xmlns:o="urn:schemas-microsoft-com:office:office" xmlns:v="urn:schemas-microsoft-com:vml" xmlns:w10="urn:schemas-microsoft-com:office:word" xmlns:a="http://schemas.openxmlformats.org/drawingml/2006/main" xmlns:pic="http://schemas.openxmlformats.org/drawingml/2006/picture" xmlns:wp="http://schemas.openxmlformats.org/drawingml/2006/wordprocessingDrawing"/>
+</file>
+
+<file path=word/footer1.xml><?xml version="1.0" encoding="utf-8"?>
+<w:ftr xmlns:w="http://schemas.openxmlformats.org/wordprocessingml/2006/main" xmlns:r="http://schemas.openxmlformats.org/officeDocument/2006/relationships">
+  <w:p>
+    <w:pPr>
+      <w:jc w:val="center"/>
+    </w:pPr>
+    <w:r>
+      <w:fldChar w:fldCharType="begin"/>
+    </w:r>
+    <w:r>
+      <w:instrText xml:space="preserve"> PAGE </w:instrText>
+    </w:r>
+    <w:r>
+      <w:fldChar w:fldCharType="separate"/>
+    </w:r>
+    <w:r>
+      <w:t>1</w:t>
+    </w:r>
+    <w:r>
+      <w:fldChar w:fldCharType="end"/>
+    </w:r>
+  </w:p>
+</w:ftr>
 </file>
 
 <file path=word/footnotes.xml><?xml version="1.0" encoding="utf-8"?>
@@ -485,15 +510,16 @@
   <w:docDefaults>
     <w:rPrDefault>
       <w:rPr>
-        <w:rFonts w:asciiTheme="minorHAnsi" w:eastAsiaTheme="minorEastAsia" w:hAnsiTheme="minorHAnsi" w:cstheme="minorBidi"/>
-        <w:sz w:val="24"/>
-        <w:szCs w:val="24"/>
+        <w:rFonts w:ascii="Times New Roman" w:hAnsi="Times New Roman" w:eastAsia="Times New Roman" w:cs="Times New Roman"/>
+        <w:sz w:val="28"/>
+        <w:szCs w:val="28"/>
         <w:lang w:val="en-US" w:eastAsia="zh-CN" w:bidi="ar-SA"/>
       </w:rPr>
     </w:rPrDefault>
     <w:pPrDefault>
       <w:pPr>
-        <w:spacing w:after="200"/>
+        <w:widowControl/>
+        <w:spacing w:after="0"/>
       </w:pPr>
     </w:pPrDefault>
   </w:docDefaults>
@@ -501,41 +527,30 @@
   <w:style w:type="paragraph" w:default="1" w:styleId="Normal">
     <w:name w:val="Normal"/>
     <w:qFormat/>
-    <w:rPr>
-      <w:rFonts w:ascii="EB Garamond" w:hAnsi="EB Garamond" w:cs="EB Garamond"/>
-      <w:sz w:val="28"/>
-      <w:szCs w:val="28"/>
-    </w:rPr>
   </w:style>
   <w:style w:type="paragraph" w:styleId="BodyText">
+    <w:name w:val="Body Text"/>
+    <w:basedOn w:val="Normal"/>
+    <w:link w:val="BodyTextChar"/>
+    <w:qFormat/>
     <w:pPr>
       <w:spacing w:before="0" w:after="0" w:line="616" w:lineRule="exact"/>
       <w:ind w:firstLine="720"/>
-      <w:jc w:val="both"/>
-    </w:pPr>
-    <w:name w:val="Body Text"/>
-    <w:basedOn w:val="Normal"/>
-    <w:link w:val="BodyTextChar"/>
-    <w:qFormat/>
+    </w:pPr>
   </w:style>
   <w:style w:type="paragraph" w:customStyle="1" w:styleId="FirstParagraph">
-    <w:pPr>
-      <w:spacing w:before="0" w:after="0" w:line="616" w:lineRule="exact"/>
-      <w:ind w:firstLine="720"/>
-      <w:jc w:val="both"/>
-    </w:pPr>
     <w:name w:val="First Paragraph"/>
     <w:basedOn w:val="BodyText"/>
     <w:next w:val="BodyText"/>
     <w:qFormat/>
   </w:style>
   <w:style w:type="paragraph" w:customStyle="1" w:styleId="Compact">
-    <w:pPr>
-      <w:spacing w:before="0" w:after="0" w:line="340" w:lineRule="exact"/>
-    </w:pPr>
     <w:name w:val="Compact"/>
     <w:basedOn w:val="BodyText"/>
     <w:qFormat/>
+    <w:pPr>
+      <w:spacing w:before="36" w:after="36"/>
+    </w:pPr>
   </w:style>
   <w:style w:type="paragraph" w:styleId="Title">
     <w:name w:val="Title"/>
@@ -671,13 +686,6 @@
     <w:rPr/>
   </w:style>
   <w:style w:type="paragraph" w:styleId="Heading1">
-    <w:pPr>
-      <w:keepNext/>
-      <w:keepLines/>
-      <w:spacing w:before="0" w:after="0" w:line="340" w:lineRule="exact"/>
-      <w:spacing w:before="240" w:after="220" w:line="340" w:lineRule="exact"/>
-      <w:jc w:val="center"/>
-    </w:pPr>
     <w:name w:val="heading 1"/>
     <w:basedOn w:val="Normal"/>
     <w:next w:val="BodyText"/>
@@ -685,19 +693,25 @@
     <w:uiPriority w:val="9"/>
     <w:qFormat/>
     <w:rsid w:val="00A10FD9"/>
-    <w:rPr>
+    <w:pPr>
+      <w:keepNext/>
+      <w:keepLines/>
+      <w:spacing w:before="240" w:after="120" w:line="340" w:lineRule="exact"/>
+      <w:ind w:firstLine="0"/>
+      <w:jc w:val="center"/>
+      <w:outlineLvl w:val="0"/>
+    </w:pPr>
+    <w:rPr>
+      <w:rFonts w:ascii="Times New Roman" w:hAnsi="Times New Roman" w:eastAsia="Times New Roman" w:cs="Times New Roman"/>
       <w:b/>
+      <w:bCs/>
       <w:caps/>
+      <w:color w:val="000000"/>
       <w:sz w:val="28"/>
       <w:szCs w:val="28"/>
     </w:rPr>
   </w:style>
   <w:style w:type="paragraph" w:styleId="Heading2">
-    <w:pPr>
-      <w:keepNext/>
-      <w:keepLines/>
-      <w:spacing w:before="200" w:after="180" w:line="340" w:lineRule="exact"/>
-    </w:pPr>
     <w:name w:val="heading 2"/>
     <w:basedOn w:val="Normal"/>
     <w:next w:val="BodyText"/>
@@ -707,19 +721,23 @@
     <w:unhideWhenUsed/>
     <w:qFormat/>
     <w:rsid w:val="00A10FD9"/>
-    <w:rPr>
-      <w:rFonts w:ascii="EB Garamond" w:hAnsi="EB Garamond" w:cs="EB Garamond"/>
+    <w:pPr>
+      <w:keepNext/>
+      <w:keepLines/>
+      <w:spacing w:before="240" w:after="120" w:line="340" w:lineRule="exact"/>
+      <w:ind w:firstLine="0"/>
+      <w:outlineLvl w:val="1"/>
+    </w:pPr>
+    <w:rPr>
+      <w:rFonts w:ascii="Times New Roman" w:hAnsi="Times New Roman" w:eastAsia="Times New Roman" w:cs="Times New Roman"/>
       <w:b/>
+      <w:bCs/>
+      <w:color w:val="000000"/>
       <w:sz w:val="28"/>
       <w:szCs w:val="28"/>
     </w:rPr>
   </w:style>
   <w:style w:type="paragraph" w:styleId="Heading3">
-    <w:pPr>
-      <w:keepNext/>
-      <w:keepLines/>
-      <w:spacing w:before="200" w:after="180" w:line="340" w:lineRule="exact"/>
-    </w:pPr>
     <w:name w:val="heading 3"/>
     <w:basedOn w:val="Normal"/>
     <w:next w:val="BodyText"/>
@@ -729,19 +747,23 @@
     <w:unhideWhenUsed/>
     <w:qFormat/>
     <w:rsid w:val="00A10FD9"/>
-    <w:rPr>
-      <w:rFonts w:ascii="EB Garamond" w:hAnsi="EB Garamond" w:cs="EB Garamond"/>
+    <w:pPr>
+      <w:keepNext/>
+      <w:keepLines/>
+      <w:spacing w:before="240" w:after="120" w:line="340" w:lineRule="exact"/>
+      <w:ind w:firstLine="0"/>
+      <w:outlineLvl w:val="2"/>
+    </w:pPr>
+    <w:rPr>
+      <w:rFonts w:ascii="Times New Roman" w:hAnsi="Times New Roman" w:eastAsia="Times New Roman" w:cs="Times New Roman"/>
       <w:b/>
+      <w:bCs/>
+      <w:color w:val="000000"/>
       <w:sz w:val="28"/>
       <w:szCs w:val="28"/>
     </w:rPr>
   </w:style>
   <w:style w:type="paragraph" w:styleId="Heading4">
-    <w:pPr>
-      <w:keepNext/>
-      <w:keepLines/>
-      <w:spacing w:before="200" w:after="180" w:line="340" w:lineRule="exact"/>
-    </w:pPr>
     <w:name w:val="heading 4"/>
     <w:basedOn w:val="Normal"/>
     <w:next w:val="BodyText"/>
@@ -751,19 +773,24 @@
     <w:unhideWhenUsed/>
     <w:qFormat/>
     <w:rsid w:val="00A10FD9"/>
-    <w:rPr>
-      <w:rFonts w:ascii="EB Garamond" w:hAnsi="EB Garamond" w:cs="EB Garamond"/>
+    <w:pPr>
+      <w:keepNext/>
+      <w:keepLines/>
+      <w:spacing w:before="240" w:after="120" w:line="340" w:lineRule="exact"/>
+      <w:ind w:firstLine="0"/>
+      <w:outlineLvl w:val="3"/>
+    </w:pPr>
+    <w:rPr>
+      <w:rFonts w:ascii="Times New Roman" w:hAnsi="Times New Roman" w:eastAsia="Times New Roman" w:cs="Times New Roman"/>
       <w:b/>
+      <w:bCs/>
+      <w:i/>
+      <w:color w:val="000000"/>
       <w:sz w:val="28"/>
       <w:szCs w:val="28"/>
     </w:rPr>
   </w:style>
   <w:style w:type="paragraph" w:styleId="Heading5">
-    <w:pPr>
-      <w:keepNext/>
-      <w:keepLines/>
-      <w:spacing w:before="200" w:after="180" w:line="340" w:lineRule="exact"/>
-    </w:pPr>
     <w:name w:val="heading 5"/>
     <w:basedOn w:val="Normal"/>
     <w:next w:val="BodyText"/>
@@ -773,9 +800,19 @@
     <w:unhideWhenUsed/>
     <w:qFormat/>
     <w:rsid w:val="00A10FD9"/>
-    <w:rPr>
-      <w:rFonts w:ascii="EB Garamond" w:hAnsi="EB Garamond" w:cs="EB Garamond"/>
+    <w:pPr>
+      <w:keepNext/>
+      <w:keepLines/>
+      <w:spacing w:before="240" w:after="120" w:line="340" w:lineRule="exact"/>
+      <w:ind w:firstLine="0"/>
+      <w:outlineLvl w:val="4"/>
+    </w:pPr>
+    <w:rPr>
+      <w:rFonts w:ascii="Times New Roman" w:hAnsi="Times New Roman" w:eastAsia="Times New Roman" w:cs="Times New Roman"/>
       <w:b/>
+      <w:bCs/>
+      <w:i/>
+      <w:color w:val="000000"/>
       <w:sz w:val="28"/>
       <w:szCs w:val="28"/>
     </w:rPr>
@@ -987,28 +1024,38 @@
       <w:color w:val="272727" w:themeColor="text1" w:themeTint="D8"/>
     </w:rPr>
   </w:style>
+  <w:style w:type="paragraph" w:customStyle="1" w:styleId="ListItem">
+    <w:name w:val="List Item"/>
+    <w:basedOn w:val="BodyText"/>
+    <w:qFormat/>
+    <w:pPr>
+      <w:spacing w:before="0" w:after="0" w:line="616" w:lineRule="exact"/>
+      <w:ind w:left="720" w:hanging="720"/>
+    </w:pPr>
+  </w:style>
   <w:style w:type="paragraph" w:styleId="BlockText">
-    <w:pPr>
-      <w:spacing w:before="0" w:after="0" w:line="340" w:lineRule="exact"/>
-      <w:ind w:left="720" w:right="720"/>
-    </w:pPr>
     <w:name w:val="Block Text"/>
     <w:basedOn w:val="BodyText"/>
     <w:next w:val="BodyText"/>
     <w:uiPriority w:val="9"/>
     <w:unhideWhenUsed/>
     <w:qFormat/>
+    <w:pPr>
+      <w:spacing w:before="280" w:after="280" w:line="340" w:lineRule="exact"/>
+      <w:ind w:firstLine="0" w:left="720" w:right="720"/>
+    </w:pPr>
   </w:style>
   <w:style w:type="paragraph" w:styleId="FootnoteText">
-    <w:pPr>
-      <w:spacing w:before="0" w:after="0" w:line="280" w:lineRule="exact"/>
-    </w:pPr>
     <w:name w:val="Footnote Text"/>
     <w:basedOn w:val="Normal"/>
     <w:next w:val="FootnoteText"/>
     <w:uiPriority w:val="9"/>
     <w:unhideWhenUsed/>
     <w:qFormat/>
+    <w:pPr>
+      <w:keepLines/>
+      <w:spacing w:before="0" w:after="140" w:line="280" w:lineRule="exact"/>
+    </w:pPr>
     <w:rPr>
       <w:sz w:val="24"/>
       <w:szCs w:val="24"/>
@@ -1022,8 +1069,8 @@
     <w:unhideWhenUsed/>
     <w:qFormat/>
     <w:pPr>
-      <w:spacing w:before="100" w:after="100"/>
-      <w:ind w:firstLine="0" w:left="480" w:right="480"/>
+      <w:spacing w:before="280" w:after="280"/>
+      <w:ind w:firstLine="0" w:left="720" w:right="720"/>
     </w:pPr>
   </w:style>
   <w:style w:type="character" w:default="1" w:styleId="DefaultParagraphFont">
@@ -1131,7 +1178,7 @@
     <w:name w:val="Hyperlink"/>
     <w:basedOn w:val="BodyTextChar"/>
     <w:rPr>
-      <w:color w:val="4F81BD" w:themeColor="accent1"/>
+      <w:color w:val="000000"/>
     </w:rPr>
   </w:style>
   <w:style w:type="paragraph" w:styleId="TOCHeading">
@@ -1151,6 +1198,171 @@
       <w:bCs w:val="0"/>
       <w:color w:val="365F91" w:themeColor="accent1" w:themeShade="BF"/>
     </w:rPr>
+  </w:style>
+  <w:style w:type="paragraph" w:customStyle="1" w:styleId="CA5NoIndent">
+    <w:name w:val="CA5 No Indent"/>
+    <w:basedOn w:val="BodyText"/>
+    <w:qFormat/>
+    <w:pPr>
+      <w:ind w:firstLine="0"/>
+    </w:pPr>
+    <w:rPr/>
+  </w:style>
+  <w:style w:type="paragraph" w:customStyle="1" w:styleId="CA5BodyLast">
+    <w:name w:val="CA5 Body Last"/>
+    <w:basedOn w:val="BodyText"/>
+    <w:qFormat/>
+    <w:pPr>
+      <w:keepNext/>
+      <w:keepLines/>
+      <w:ind w:firstLine="0"/>
+    </w:pPr>
+    <w:rPr/>
+  </w:style>
+  <w:style w:type="paragraph" w:customStyle="1" w:styleId="CA5Title">
+    <w:name w:val="CA5 Title"/>
+    <w:basedOn w:val="Normal"/>
+    <w:qFormat/>
+    <w:pPr>
+      <w:keepNext/>
+      <w:keepLines/>
+      <w:spacing w:before="560" w:after="252" w:line="340" w:lineRule="exact"/>
+      <w:ind w:firstLine="0"/>
+      <w:jc w:val="center"/>
+      <w:outlineLvl w:val="0"/>
+    </w:pPr>
+    <w:rPr>
+      <w:b/>
+      <w:bCs/>
+      <w:caps/>
+      <w:sz w:val="32"/>
+      <w:szCs w:val="32"/>
+    </w:rPr>
+  </w:style>
+  <w:style w:type="paragraph" w:customStyle="1" w:styleId="CA5TableTitle">
+    <w:name w:val="CA5 Table Title"/>
+    <w:basedOn w:val="CA5Title"/>
+    <w:qFormat/>
+    <w:pPr>
+      <w:spacing w:before="0" w:after="336" w:line="340" w:lineRule="exact"/>
+    </w:pPr>
+    <w:rPr/>
+  </w:style>
+  <w:style w:type="paragraph" w:customStyle="1" w:styleId="CA5Sub2">
+    <w:name w:val="CA5 Sub 2"/>
+    <w:basedOn w:val="Normal"/>
+    <w:qFormat/>
+    <w:pPr>
+      <w:keepNext/>
+      <w:keepLines/>
+      <w:tabs>
+        <w:tab w:val="left" w:pos="864"/>
+      </w:tabs>
+      <w:spacing w:before="560" w:after="252" w:line="340" w:lineRule="exact"/>
+      <w:ind w:left="864" w:hanging="864"/>
+      <w:outlineLvl w:val="1"/>
+    </w:pPr>
+    <w:rPr/>
+  </w:style>
+  <w:style w:type="paragraph" w:customStyle="1" w:styleId="CA5Sub3">
+    <w:name w:val="CA5 Sub 3"/>
+    <w:basedOn w:val="Normal"/>
+    <w:qFormat/>
+    <w:pPr>
+      <w:keepNext/>
+      <w:keepLines/>
+      <w:tabs>
+        <w:tab w:val="left" w:pos="1584"/>
+      </w:tabs>
+      <w:spacing w:before="560" w:after="224" w:line="340" w:lineRule="exact"/>
+      <w:ind w:left="1584" w:hanging="864"/>
+      <w:outlineLvl w:val="2"/>
+    </w:pPr>
+    <w:rPr/>
+  </w:style>
+  <w:style w:type="paragraph" w:customStyle="1" w:styleId="CA5Sub4">
+    <w:name w:val="CA5 Sub 4"/>
+    <w:basedOn w:val="Normal"/>
+    <w:qFormat/>
+    <w:pPr>
+      <w:keepNext/>
+      <w:keepLines/>
+      <w:tabs>
+        <w:tab w:val="left" w:pos="2304"/>
+      </w:tabs>
+      <w:spacing w:before="560" w:after="224" w:line="340" w:lineRule="exact"/>
+      <w:ind w:left="2304" w:hanging="864"/>
+      <w:outlineLvl w:val="3"/>
+    </w:pPr>
+    <w:rPr/>
+  </w:style>
+  <w:style w:type="paragraph" w:customStyle="1" w:styleId="CA5Sub5">
+    <w:name w:val="CA5 Sub 5"/>
+    <w:basedOn w:val="Normal"/>
+    <w:qFormat/>
+    <w:pPr>
+      <w:keepNext/>
+      <w:keepLines/>
+      <w:tabs>
+        <w:tab w:val="left" w:pos="3024"/>
+      </w:tabs>
+      <w:spacing w:before="560" w:after="224" w:line="340" w:lineRule="exact"/>
+      <w:ind w:left="3024" w:hanging="864"/>
+      <w:outlineLvl w:val="4"/>
+    </w:pPr>
+    <w:rPr/>
+  </w:style>
+  <w:style w:type="paragraph" w:customStyle="1" w:styleId="CA5Centered">
+    <w:name w:val="CA5 Centered"/>
+    <w:basedOn w:val="Normal"/>
+    <w:qFormat/>
+    <w:pPr>
+      <w:spacing w:before="0" w:after="0" w:line="340" w:lineRule="exact"/>
+      <w:ind w:firstLine="0"/>
+      <w:jc w:val="center"/>
+    </w:pPr>
+    <w:rPr/>
+  </w:style>
+  <w:style w:type="paragraph" w:customStyle="1" w:styleId="CA5Single">
+    <w:name w:val="CA5 Single"/>
+    <w:basedOn w:val="Normal"/>
+    <w:qFormat/>
+    <w:pPr>
+      <w:spacing w:before="0" w:after="0" w:line="340" w:lineRule="exact"/>
+      <w:ind w:firstLine="0"/>
+    </w:pPr>
+    <w:rPr/>
+  </w:style>
+  <w:style w:type="paragraph" w:customStyle="1" w:styleId="CA5Signature">
+    <w:name w:val="CA5 Signature"/>
+    <w:basedOn w:val="Normal"/>
+    <w:qFormat/>
+    <w:pPr>
+      <w:keepNext/>
+      <w:keepLines/>
+      <w:spacing w:before="0" w:after="0" w:line="340" w:lineRule="exact"/>
+      <w:ind w:left="4320" w:firstLine="0"/>
+    </w:pPr>
+    <w:rPr/>
+  </w:style>
+  <w:style w:type="paragraph" w:customStyle="1" w:styleId="CA5Cip">
+    <w:name w:val="CA5 CIP"/>
+    <w:basedOn w:val="Normal"/>
+    <w:qFormat/>
+    <w:pPr>
+      <w:spacing w:before="140" w:after="0" w:line="340" w:lineRule="exact"/>
+      <w:ind w:firstLine="720"/>
+    </w:pPr>
+    <w:rPr/>
+  </w:style>
+  <w:style w:type="paragraph" w:customStyle="1" w:styleId="CA5CipNoIndent">
+    <w:name w:val="CA5 CIP No Indent"/>
+    <w:basedOn w:val="CA5Cip"/>
+    <w:qFormat/>
+    <w:pPr>
+      <w:ind w:firstLine="0"/>
+    </w:pPr>
+    <w:rPr/>
   </w:style>
 </w:styles>
 </file>

</xml_diff>